<commit_message>
Release 0.7.3: Public OSS release — restored top-level docs
</commit_message>
<xml_diff>
--- a/docs/Bloodstone-QUASAR-51-Percent-Defense-White-Paper.docx
+++ b/docs/Bloodstone-QUASAR-51-Percent-Defense-White-Paper.docx
@@ -1737,7 +1737,7 @@
       <w:pPr>
         <w:spacing w:after="120"/>
       </w:pPr>
-      <w:hyperlink w:history="1" r:id="rId_uk3h-bfanweto6cgl2eu">
+      <w:hyperlink w:history="1" r:id="rIdq3pao_vmgpqz1_4drkvln">
         <w:r>
           <w:rPr>
             <w:rStyle w:val="Hyperlink"/>
@@ -1750,7 +1750,7 @@
       <w:pPr>
         <w:spacing w:after="120"/>
       </w:pPr>
-      <w:hyperlink w:history="1" r:id="rId06vzav9sgjhta98mdtix5">
+      <w:hyperlink w:history="1" r:id="rIdgthxcdb-seg_kgippiedt">
         <w:r>
           <w:rPr>
             <w:rStyle w:val="Hyperlink"/>
@@ -1763,7 +1763,7 @@
       <w:pPr>
         <w:spacing w:after="120"/>
       </w:pPr>
-      <w:hyperlink w:history="1" r:id="rIdz_cytfbtp67sndkoq748e">
+      <w:hyperlink w:history="1" r:id="rIdjidvpcjs1vtdoayy7xpek">
         <w:r>
           <w:rPr>
             <w:rStyle w:val="Hyperlink"/>

</xml_diff>

<commit_message>
Release 0.7.4-beta: QUASAR Phase 1 — epoch braid in explorer, /api/quasar/status, exchange API quasar block, witness-aware confirmation guide
</commit_message>
<xml_diff>
--- a/docs/Bloodstone-QUASAR-51-Percent-Defense-White-Paper.docx
+++ b/docs/Bloodstone-QUASAR-51-Percent-Defense-White-Paper.docx
@@ -1737,7 +1737,7 @@
       <w:pPr>
         <w:spacing w:after="120"/>
       </w:pPr>
-      <w:hyperlink w:history="1" r:id="rIdq3pao_vmgpqz1_4drkvln">
+      <w:hyperlink w:history="1" r:id="rIdlfyo1pqrj-8o89_iaj3bz">
         <w:r>
           <w:rPr>
             <w:rStyle w:val="Hyperlink"/>
@@ -1750,7 +1750,7 @@
       <w:pPr>
         <w:spacing w:after="120"/>
       </w:pPr>
-      <w:hyperlink w:history="1" r:id="rIdgthxcdb-seg_kgippiedt">
+      <w:hyperlink w:history="1" r:id="rIdbzij9fmvef9qzbzewir_c">
         <w:r>
           <w:rPr>
             <w:rStyle w:val="Hyperlink"/>
@@ -1763,7 +1763,7 @@
       <w:pPr>
         <w:spacing w:after="120"/>
       </w:pPr>
-      <w:hyperlink w:history="1" r:id="rIdjidvpcjs1vtdoayy7xpek">
+      <w:hyperlink w:history="1" r:id="rIdjewsocjkrrb1ys3cgpjn0">
         <w:r>
           <w:rPr>
             <w:rStyle w:val="Hyperlink"/>

</xml_diff>

<commit_message>
Release 0.7.5-beta: QUASAR Phase 2 — witness capsules, LAN echo quorum, anomaly tripwires, quasar-client.js
</commit_message>
<xml_diff>
--- a/docs/Bloodstone-QUASAR-51-Percent-Defense-White-Paper.docx
+++ b/docs/Bloodstone-QUASAR-51-Percent-Defense-White-Paper.docx
@@ -1737,7 +1737,7 @@
       <w:pPr>
         <w:spacing w:after="120"/>
       </w:pPr>
-      <w:hyperlink w:history="1" r:id="rIdlfyo1pqrj-8o89_iaj3bz">
+      <w:hyperlink w:history="1" r:id="rId6pa4_ux2ipb4cycnylpqd">
         <w:r>
           <w:rPr>
             <w:rStyle w:val="Hyperlink"/>
@@ -1750,7 +1750,7 @@
       <w:pPr>
         <w:spacing w:after="120"/>
       </w:pPr>
-      <w:hyperlink w:history="1" r:id="rIdbzij9fmvef9qzbzewir_c">
+      <w:hyperlink w:history="1" r:id="rIdbtfhthuv8by7g6j1fzlk3">
         <w:r>
           <w:rPr>
             <w:rStyle w:val="Hyperlink"/>
@@ -1763,7 +1763,7 @@
       <w:pPr>
         <w:spacing w:after="120"/>
       </w:pPr>
-      <w:hyperlink w:history="1" r:id="rIdjewsocjkrrb1ys3cgpjn0">
+      <w:hyperlink w:history="1" r:id="rIdknvzzvfpcnkldczh3funm">
         <w:r>
           <w:rPr>
             <w:rStyle w:val="Hyperlink"/>

</xml_diff>

<commit_message>
Release 0.7.6-beta: QUASAR Phase 3 — braid index sync, enforcement/check API, activation descriptor, quasar.cpp RPC, ops modules
</commit_message>
<xml_diff>
--- a/docs/Bloodstone-QUASAR-51-Percent-Defense-White-Paper.docx
+++ b/docs/Bloodstone-QUASAR-51-Percent-Defense-White-Paper.docx
@@ -1737,7 +1737,7 @@
       <w:pPr>
         <w:spacing w:after="120"/>
       </w:pPr>
-      <w:hyperlink w:history="1" r:id="rId6pa4_ux2ipb4cycnylpqd">
+      <w:hyperlink w:history="1" r:id="rId2ahfqqfsntfyy5nwel9ag">
         <w:r>
           <w:rPr>
             <w:rStyle w:val="Hyperlink"/>
@@ -1750,7 +1750,7 @@
       <w:pPr>
         <w:spacing w:after="120"/>
       </w:pPr>
-      <w:hyperlink w:history="1" r:id="rIdbtfhthuv8by7g6j1fzlk3">
+      <w:hyperlink w:history="1" r:id="rIddi9flewz9tnq9apucuuyf">
         <w:r>
           <w:rPr>
             <w:rStyle w:val="Hyperlink"/>
@@ -1763,7 +1763,7 @@
       <w:pPr>
         <w:spacing w:after="120"/>
       </w:pPr>
-      <w:hyperlink w:history="1" r:id="rIdknvzzvfpcnkldczh3funm">
+      <w:hyperlink w:history="1" r:id="rId_cmocil1glyjkuns6aseu">
         <w:r>
           <w:rPr>
             <w:rStyle w:val="Hyperlink"/>

</xml_diff>

<commit_message>
Release 0.7.7-beta: QUASAR Phase 4 — signaling API, fork-rehearsal coordinator, quasar_braid_finality deployment scaffold
</commit_message>
<xml_diff>
--- a/docs/Bloodstone-QUASAR-51-Percent-Defense-White-Paper.docx
+++ b/docs/Bloodstone-QUASAR-51-Percent-Defense-White-Paper.docx
@@ -1737,7 +1737,7 @@
       <w:pPr>
         <w:spacing w:after="120"/>
       </w:pPr>
-      <w:hyperlink w:history="1" r:id="rId2ahfqqfsntfyy5nwel9ag">
+      <w:hyperlink w:history="1" r:id="rId-jkgnnomss0mel5tivfug">
         <w:r>
           <w:rPr>
             <w:rStyle w:val="Hyperlink"/>
@@ -1750,7 +1750,7 @@
       <w:pPr>
         <w:spacing w:after="120"/>
       </w:pPr>
-      <w:hyperlink w:history="1" r:id="rIddi9flewz9tnq9apucuuyf">
+      <w:hyperlink w:history="1" r:id="rIdtt0yjk_rzilgz9xiqab_h">
         <w:r>
           <w:rPr>
             <w:rStyle w:val="Hyperlink"/>
@@ -1763,7 +1763,7 @@
       <w:pPr>
         <w:spacing w:after="120"/>
       </w:pPr>
-      <w:hyperlink w:history="1" r:id="rId_cmocil1glyjkuns6aseu">
+      <w:hyperlink w:history="1" r:id="rIdo0d8ooxvq8kiq8mxiwlkf">
         <w:r>
           <w:rPr>
             <w:rStyle w:val="Hyperlink"/>

</xml_diff>